<commit_message>
eCRF 46: opmaak en huisstijl afgestemd op de overige eCRF's
Eerste versie week orange gekleurde balken en site-kleuren (00407A/FF7A00) i.p.v. de
huisstijl die de bestaande Word-eCRF's (36, 44, 45a/45b) effectief gebruiken: navy
123A5F voor titels/sectiekoppen zonder achtergrondkleur, 24303B/2E3B47 voor labels en
lopende tekst, en losse checkbox-regels (een optie per lijn) i.p.v. samengevoegde
tabelcellen. Structuur volledig herbouwd volgens dat patroon; footer verwees ook nog
naar "eCRF 45b" en is gecorrigeerd naar "eCRF 46".
</commit_message>
<xml_diff>
--- a/(e)CRF/Per nummer/46_AE-SAE Report Form.docx
+++ b/(e)CRF/Per nummer/46_AE-SAE Report Form.docx
@@ -6,18 +6,18 @@
       <w:r>
         <w:rPr>
           <w:b/>
-          <w:color w:val="00407A"/>
-          <w:sz w:val="32"/>
-        </w:rPr>
-        <w:t>Appendix 46: Adverse Event / Serious Adverse Event Report Form</w:t>
+          <w:color w:val="123A5F"/>
+          <w:sz w:val="28"/>
+        </w:rPr>
+        <w:t>Appendix 46: AE/SAE Report Form</w:t>
       </w:r>
     </w:p>
     <w:p>
       <w:r>
         <w:rPr>
           <w:b/>
-          <w:color w:val="1D8DB0"/>
-          <w:sz w:val="21"/>
+          <w:color w:val="123A5F"/>
+          <w:sz w:val="24"/>
         </w:rPr>
         <w:t>Studie-informatie</w:t>
       </w:r>
@@ -25,9 +25,7 @@
     <w:p>
       <w:r>
         <w:rPr>
-          <w:i w:val="0"/>
-          <w:color w:val="2E3B47"/>
-          <w:sz w:val="20"/>
+          <w:color w:val="24303B"/>
         </w:rPr>
         <w:t>Studie titel: Towards Pressure-Adherence &amp; Education Driven Service in Diabetic Foot Disease (PARADISE trial)</w:t>
       </w:r>
@@ -35,9 +33,7 @@
     <w:p>
       <w:r>
         <w:rPr>
-          <w:i w:val="0"/>
-          <w:color w:val="2E3B47"/>
-          <w:sz w:val="20"/>
+          <w:color w:val="24303B"/>
         </w:rPr>
         <w:t>Protocolnummer: S71769</w:t>
       </w:r>
@@ -45,9 +41,7 @@
     <w:p>
       <w:r>
         <w:rPr>
-          <w:i w:val="0"/>
-          <w:color w:val="2E3B47"/>
-          <w:sz w:val="20"/>
+          <w:color w:val="24303B"/>
         </w:rPr>
         <w:t xml:space="preserve">Studielocatie: </w:t>
         <w:tab/>
@@ -56,9 +50,7 @@
     <w:p>
       <w:r>
         <w:rPr>
-          <w:i w:val="0"/>
-          <w:color w:val="2E3B47"/>
-          <w:sz w:val="20"/>
+          <w:color w:val="24303B"/>
         </w:rPr>
         <w:t xml:space="preserve">Hoofdonderzoeker (PI): </w:t>
         <w:tab/>
@@ -67,9 +59,7 @@
     <w:p>
       <w:r>
         <w:rPr>
-          <w:i w:val="0"/>
-          <w:color w:val="2E3B47"/>
-          <w:sz w:val="20"/>
+          <w:color w:val="24303B"/>
         </w:rPr>
         <w:t xml:space="preserve">Deelnemerscode: </w:t>
         <w:tab/>
@@ -78,1162 +68,681 @@
     <w:p>
       <w:r>
         <w:rPr>
-          <w:i w:val="0"/>
-          <w:color w:val="2E3B47"/>
-          <w:sz w:val="20"/>
-        </w:rPr>
-        <w:t>In te vullen door: de behandelend arts of PI, bij kennisname van elk adverse event (AE) of serious adverse event (SAE), conform §6 (Assessments of Safety) van het protocol.</w:t>
-      </w:r>
-    </w:p>
-    <w:p>
-      <w:pPr>
-        <w:spacing w:before="200" w:after="80"/>
-        <w:shd w:val="clear" w:color="auto" w:fill="FF7A00"/>
-      </w:pPr>
+          <w:color w:val="2E3B47"/>
+        </w:rPr>
+        <w:t>In te vullen door de behandelend arts of PI, bij kennisname van elk adverse event (AE) of serious adverse event (SAE), conform §6 (Assessments of Safety) van het protocol.</w:t>
+      </w:r>
+    </w:p>
+    <w:p/>
+    <w:p>
       <w:r>
         <w:rPr>
           <w:b/>
-          <w:color w:val="FFFFFF"/>
+          <w:color w:val="123A5F"/>
           <w:sz w:val="24"/>
         </w:rPr>
-        <w:t xml:space="preserve">  1. Beschrijving van het event</w:t>
-      </w:r>
-    </w:p>
-    <w:tbl>
-      <w:tblPr>
-        <w:tblW w:type="auto" w:w="0"/>
-        <w:tblLook w:firstColumn="1" w:firstRow="1" w:lastColumn="0" w:lastRow="0" w:noHBand="0" w:noVBand="1" w:val="04A0"/>
-        <w:tblBorders>
-          <w:top w:val="single" w:sz="4" w:space="0" w:color="B9C7D1"/>
-          <w:left w:val="single" w:sz="4" w:space="0" w:color="B9C7D1"/>
-          <w:bottom w:val="single" w:sz="4" w:space="0" w:color="B9C7D1"/>
-          <w:right w:val="single" w:sz="4" w:space="0" w:color="B9C7D1"/>
-          <w:insideH w:val="single" w:sz="4" w:space="0" w:color="B9C7D1"/>
-          <w:insideV w:val="single" w:sz="4" w:space="0" w:color="B9C7D1"/>
-        </w:tblBorders>
-      </w:tblPr>
-      <w:tblGrid>
-        <w:gridCol w:w="4536"/>
-        <w:gridCol w:w="4536"/>
-      </w:tblGrid>
-      <w:tr>
-        <w:tc>
-          <w:tcPr>
-            <w:tcW w:type="dxa" w:w="4536"/>
-          </w:tcPr>
-          <w:p>
-            <w:r/>
-            <w:r>
-              <w:rPr>
-                <w:b/>
-                <w:color w:val="00407A"/>
-                <w:sz w:val="20"/>
-              </w:rPr>
-              <w:t>Datum kennisname event</w:t>
-            </w:r>
-          </w:p>
-        </w:tc>
-        <w:tc>
-          <w:tcPr>
-            <w:tcW w:type="dxa" w:w="4536"/>
-          </w:tcPr>
-          <w:p>
-            <w:r/>
-            <w:r>
-              <w:rPr>
-                <w:b w:val="0"/>
-                <w:color w:val="2E3B47"/>
-                <w:sz w:val="20"/>
-              </w:rPr>
-            </w:r>
-          </w:p>
-        </w:tc>
-      </w:tr>
-      <w:tr>
-        <w:tc>
-          <w:tcPr>
-            <w:tcW w:type="dxa" w:w="4536"/>
-          </w:tcPr>
-          <w:p>
-            <w:r/>
-            <w:r>
-              <w:rPr>
-                <w:b/>
-                <w:color w:val="00407A"/>
-                <w:sz w:val="20"/>
-              </w:rPr>
-              <w:t>Datum aanvang event (indien gekend)</w:t>
-            </w:r>
-          </w:p>
-        </w:tc>
-        <w:tc>
-          <w:tcPr>
-            <w:tcW w:type="dxa" w:w="4536"/>
-          </w:tcPr>
-          <w:p>
-            <w:r/>
-            <w:r>
-              <w:rPr>
-                <w:b w:val="0"/>
-                <w:color w:val="2E3B47"/>
-                <w:sz w:val="20"/>
-              </w:rPr>
-            </w:r>
-          </w:p>
-        </w:tc>
-      </w:tr>
-      <w:tr>
-        <w:tc>
-          <w:tcPr>
-            <w:tcW w:type="dxa" w:w="4536"/>
-          </w:tcPr>
-          <w:p>
-            <w:r/>
-            <w:r>
-              <w:rPr>
-                <w:b/>
-                <w:color w:val="00407A"/>
-                <w:sz w:val="20"/>
-              </w:rPr>
-              <w:t>Beschrijving van het event</w:t>
-            </w:r>
-          </w:p>
-        </w:tc>
-        <w:tc>
-          <w:tcPr>
-            <w:tcW w:type="dxa" w:w="4536"/>
-          </w:tcPr>
-          <w:p>
-            <w:r/>
-            <w:r>
-              <w:rPr>
-                <w:b w:val="0"/>
-                <w:color w:val="2E3B47"/>
-                <w:sz w:val="20"/>
-              </w:rPr>
-            </w:r>
-          </w:p>
-        </w:tc>
-      </w:tr>
-      <w:tr>
-        <w:tc>
-          <w:tcPr>
-            <w:tcW w:type="dxa" w:w="4536"/>
-          </w:tcPr>
-          <w:p>
-            <w:r/>
-            <w:r>
-              <w:rPr>
-                <w:b/>
-                <w:color w:val="00407A"/>
-                <w:sz w:val="20"/>
-              </w:rPr>
-              <w:t>Betrokken lichaamsdeel/orgaan (indien van toepassing)</w:t>
-            </w:r>
-          </w:p>
-        </w:tc>
-        <w:tc>
-          <w:tcPr>
-            <w:tcW w:type="dxa" w:w="4536"/>
-          </w:tcPr>
-          <w:p>
-            <w:r/>
-            <w:r>
-              <w:rPr>
-                <w:b w:val="0"/>
-                <w:color w:val="2E3B47"/>
-                <w:sz w:val="20"/>
-              </w:rPr>
-            </w:r>
-          </w:p>
-        </w:tc>
-      </w:tr>
-      <w:tr>
-        <w:tc>
-          <w:tcPr>
-            <w:tcW w:type="dxa" w:w="4536"/>
-          </w:tcPr>
-          <w:p>
-            <w:r/>
-            <w:r>
-              <w:rPr>
-                <w:b/>
-                <w:color w:val="00407A"/>
-                <w:sz w:val="20"/>
-              </w:rPr>
-              <w:t>Is dit event gerelateerd aan een voetulcus die al via eCRF-document 36 (PEDIS) of 38 (WIfI) werd geclassificeerd?</w:t>
-            </w:r>
-          </w:p>
-        </w:tc>
-        <w:tc>
-          <w:tcPr>
-            <w:tcW w:type="dxa" w:w="4536"/>
-          </w:tcPr>
-          <w:p>
-            <w:r/>
-            <w:r>
-              <w:rPr>
-                <w:b w:val="0"/>
-                <w:color w:val="2E3B47"/>
-                <w:sz w:val="20"/>
-              </w:rPr>
-              <w:t>Ja / Nee / N.v.t.</w:t>
-            </w:r>
-          </w:p>
-        </w:tc>
-      </w:tr>
-      <w:tr>
-        <w:tc>
-          <w:tcPr>
-            <w:tcW w:type="dxa" w:w="4536"/>
-          </w:tcPr>
-          <w:p>
-            <w:r/>
-            <w:r>
-              <w:rPr>
-                <w:b/>
-                <w:color w:val="00407A"/>
-                <w:sz w:val="20"/>
-              </w:rPr>
-              <w:t>Zo ja, welk eCRF-documentnummer/datum van die classificatie</w:t>
-            </w:r>
-          </w:p>
-        </w:tc>
-        <w:tc>
-          <w:tcPr>
-            <w:tcW w:type="dxa" w:w="4536"/>
-          </w:tcPr>
-          <w:p>
-            <w:r/>
-            <w:r>
-              <w:rPr>
-                <w:b w:val="0"/>
-                <w:color w:val="2E3B47"/>
-                <w:sz w:val="20"/>
-              </w:rPr>
-            </w:r>
-          </w:p>
-        </w:tc>
-      </w:tr>
-    </w:tbl>
-    <w:p>
-      <w:pPr>
-        <w:spacing w:before="200" w:after="80"/>
-        <w:shd w:val="clear" w:color="auto" w:fill="FF7A00"/>
-      </w:pPr>
+        <w:t>1. Beschrijving van het event</w:t>
+      </w:r>
+    </w:p>
+    <w:p>
+      <w:r>
+        <w:rPr>
+          <w:color w:val="24303B"/>
+        </w:rPr>
+        <w:t>Datum kennisname event: ____ / ____ / ______</w:t>
+      </w:r>
+    </w:p>
+    <w:p>
+      <w:r>
+        <w:rPr>
+          <w:color w:val="24303B"/>
+        </w:rPr>
+        <w:t>Datum aanvang event (indien gekend): ____ / ____ / ______</w:t>
+      </w:r>
+    </w:p>
+    <w:p>
+      <w:r>
+        <w:rPr>
+          <w:color w:val="2E3B47"/>
+        </w:rPr>
+        <w:t>Beschrijving van het event:</w:t>
+      </w:r>
+    </w:p>
+    <w:p>
+      <w:r>
+        <w:rPr>
+          <w:color w:val="24303B"/>
+        </w:rPr>
+        <w:t>_____________________________________________________________________</w:t>
+      </w:r>
+    </w:p>
+    <w:p>
+      <w:r>
+        <w:rPr>
+          <w:color w:val="24303B"/>
+        </w:rPr>
+        <w:t>_____________________________________________________________________</w:t>
+      </w:r>
+    </w:p>
+    <w:p>
+      <w:r>
+        <w:rPr>
+          <w:color w:val="24303B"/>
+        </w:rPr>
+        <w:t>Betrokken lichaamsdeel/orgaan (indien van toepassing): _____________________________</w:t>
+      </w:r>
+    </w:p>
+    <w:p>
+      <w:r>
+        <w:rPr>
+          <w:color w:val="2E3B47"/>
+        </w:rPr>
+        <w:t>Gerelateerd aan een voetulcus eerder geclassificeerd via eCRF-document 36 (PEDIS) of 38 (WIfI)?</w:t>
+      </w:r>
+    </w:p>
+    <w:p>
+      <w:r>
+        <w:rPr>
+          <w:color w:val="2E3B47"/>
+        </w:rPr>
+        <w:t>☐ Ja</w:t>
+      </w:r>
+    </w:p>
+    <w:p>
+      <w:r>
+        <w:rPr>
+          <w:color w:val="2E3B47"/>
+        </w:rPr>
+        <w:t>☐ Nee</w:t>
+      </w:r>
+    </w:p>
+    <w:p>
+      <w:r>
+        <w:rPr>
+          <w:color w:val="2E3B47"/>
+        </w:rPr>
+        <w:t>☐ N.v.t.</w:t>
+      </w:r>
+    </w:p>
+    <w:p>
+      <w:r>
+        <w:rPr>
+          <w:color w:val="24303B"/>
+        </w:rPr>
+        <w:t>Zo ja, documentnummer/datum van die classificatie: _____________________________</w:t>
+      </w:r>
+    </w:p>
+    <w:p/>
+    <w:p>
       <w:r>
         <w:rPr>
           <w:b/>
-          <w:color w:val="FFFFFF"/>
+          <w:color w:val="123A5F"/>
           <w:sz w:val="24"/>
         </w:rPr>
-        <w:t xml:space="preserve">  2. Ernst</w:t>
-      </w:r>
-    </w:p>
-    <w:p>
-      <w:r>
-        <w:rPr>
-          <w:i w:val="0"/>
-          <w:color w:val="2E3B47"/>
-          <w:sz w:val="20"/>
-        </w:rPr>
-        <w:t>Is dit event een Serious Adverse Event (SAE)? Een SAE is elk event dat resulteert in: overlijden, een levensbedreigende situatie, hospitalisatie of verlenging van bestaande hospitalisatie, blijvende of significante invaliditeit, een aangeboren afwijking, of een andere belangrijke medische gebeurtenis.</w:t>
-      </w:r>
-    </w:p>
-    <w:tbl>
-      <w:tblPr>
-        <w:tblW w:type="auto" w:w="0"/>
-        <w:tblLook w:firstColumn="1" w:firstRow="1" w:lastColumn="0" w:lastRow="0" w:noHBand="0" w:noVBand="1" w:val="04A0"/>
-        <w:tblBorders>
-          <w:top w:val="single" w:sz="4" w:space="0" w:color="B9C7D1"/>
-          <w:left w:val="single" w:sz="4" w:space="0" w:color="B9C7D1"/>
-          <w:bottom w:val="single" w:sz="4" w:space="0" w:color="B9C7D1"/>
-          <w:right w:val="single" w:sz="4" w:space="0" w:color="B9C7D1"/>
-          <w:insideH w:val="single" w:sz="4" w:space="0" w:color="B9C7D1"/>
-          <w:insideV w:val="single" w:sz="4" w:space="0" w:color="B9C7D1"/>
-        </w:tblBorders>
-      </w:tblPr>
-      <w:tblGrid>
-        <w:gridCol w:w="4536"/>
-        <w:gridCol w:w="4536"/>
-      </w:tblGrid>
-      <w:tr>
-        <w:tc>
-          <w:tcPr>
-            <w:tcW w:type="dxa" w:w="4536"/>
-          </w:tcPr>
-          <w:p>
-            <w:r/>
-            <w:r>
-              <w:rPr>
-                <w:b/>
-                <w:color w:val="00407A"/>
-                <w:sz w:val="20"/>
-              </w:rPr>
-              <w:t>Classificatie</w:t>
-            </w:r>
-          </w:p>
-        </w:tc>
-        <w:tc>
-          <w:tcPr>
-            <w:tcW w:type="dxa" w:w="4536"/>
-          </w:tcPr>
-          <w:p>
-            <w:r/>
-            <w:r>
-              <w:rPr>
-                <w:b w:val="0"/>
-                <w:color w:val="2E3B47"/>
-                <w:sz w:val="20"/>
-              </w:rPr>
-              <w:t>☐ Adverse Event (AE)   ☐ Serious Adverse Event (SAE)</w:t>
-            </w:r>
-          </w:p>
-        </w:tc>
-      </w:tr>
-      <w:tr>
-        <w:tc>
-          <w:tcPr>
-            <w:tcW w:type="dxa" w:w="4536"/>
-          </w:tcPr>
-          <w:p>
-            <w:r/>
-            <w:r>
-              <w:rPr>
-                <w:b/>
-                <w:color w:val="00407A"/>
-                <w:sz w:val="20"/>
-              </w:rPr>
-              <w:t>Indien SAE, reden ernstig (meerdere mogelijk)</w:t>
-            </w:r>
-          </w:p>
-        </w:tc>
-        <w:tc>
-          <w:tcPr>
-            <w:tcW w:type="dxa" w:w="4536"/>
-          </w:tcPr>
-          <w:p>
-            <w:r/>
-            <w:r>
-              <w:rPr>
-                <w:b w:val="0"/>
-                <w:color w:val="2E3B47"/>
-                <w:sz w:val="20"/>
-              </w:rPr>
-              <w:t>☐ Overlijden   ☐ Levensbedreigend   ☐ Hospitalisatie/verlenging   ☐ Blijvende/significante invaliditeit   ☐ Aangeboren afwijking   ☐ Andere belangrijke medische gebeurtenis</w:t>
-            </w:r>
-          </w:p>
-        </w:tc>
-      </w:tr>
-      <w:tr>
-        <w:tc>
-          <w:tcPr>
-            <w:tcW w:type="dxa" w:w="4536"/>
-          </w:tcPr>
-          <w:p>
-            <w:r/>
-            <w:r>
-              <w:rPr>
-                <w:b/>
-                <w:color w:val="00407A"/>
-                <w:sz w:val="20"/>
-              </w:rPr>
-              <w:t>Ernstgraad</w:t>
-            </w:r>
-          </w:p>
-        </w:tc>
-        <w:tc>
-          <w:tcPr>
-            <w:tcW w:type="dxa" w:w="4536"/>
-          </w:tcPr>
-          <w:p>
-            <w:r/>
-            <w:r>
-              <w:rPr>
-                <w:b w:val="0"/>
-                <w:color w:val="2E3B47"/>
-                <w:sz w:val="20"/>
-              </w:rPr>
-              <w:t>☐ Mild   ☐ Matig   ☐ Ernstig</w:t>
-            </w:r>
-          </w:p>
-        </w:tc>
-      </w:tr>
-      <w:tr>
-        <w:tc>
-          <w:tcPr>
-            <w:tcW w:type="dxa" w:w="4536"/>
-          </w:tcPr>
-          <w:p>
-            <w:r/>
-            <w:r>
-              <w:rPr>
-                <w:b/>
-                <w:color w:val="00407A"/>
-                <w:sz w:val="20"/>
-              </w:rPr>
-              <w:t>Causaliteit t.o.v. de PARADISE-interventie (CMFO, drukmeting, MoveMonitor, Orthotimer, SEBIA-educatie)</w:t>
-            </w:r>
-          </w:p>
-        </w:tc>
-        <w:tc>
-          <w:tcPr>
-            <w:tcW w:type="dxa" w:w="4536"/>
-          </w:tcPr>
-          <w:p>
-            <w:r/>
-            <w:r>
-              <w:rPr>
-                <w:b w:val="0"/>
-                <w:color w:val="2E3B47"/>
-                <w:sz w:val="20"/>
-              </w:rPr>
-              <w:t>☐ Niet gerelateerd   ☐ Onwaarschijnlijk gerelateerd   ☐ Mogelijk gerelateerd   ☐ Waarschijnlijk gerelateerd   ☐ Zeker gerelateerd</w:t>
-            </w:r>
-          </w:p>
-        </w:tc>
-      </w:tr>
-      <w:tr>
-        <w:tc>
-          <w:tcPr>
-            <w:tcW w:type="dxa" w:w="4536"/>
-          </w:tcPr>
-          <w:p>
-            <w:r/>
-            <w:r>
-              <w:rPr>
-                <w:b/>
-                <w:color w:val="00407A"/>
-                <w:sz w:val="20"/>
-              </w:rPr>
-              <w:t>Verwacht op basis van het risicoprofiel van de patiënt/interventie?</w:t>
-            </w:r>
-          </w:p>
-        </w:tc>
-        <w:tc>
-          <w:tcPr>
-            <w:tcW w:type="dxa" w:w="4536"/>
-          </w:tcPr>
-          <w:p>
-            <w:r/>
-            <w:r>
-              <w:rPr>
-                <w:b w:val="0"/>
-                <w:color w:val="2E3B47"/>
-                <w:sz w:val="20"/>
-              </w:rPr>
-              <w:t>☐ Verwacht   ☐ Onverwacht</w:t>
-            </w:r>
-          </w:p>
-        </w:tc>
-      </w:tr>
-      <w:tr>
-        <w:tc>
-          <w:tcPr>
-            <w:tcW w:type="dxa" w:w="4536"/>
-          </w:tcPr>
-          <w:p>
-            <w:r/>
-            <w:r>
-              <w:rPr>
-                <w:b/>
-                <w:color w:val="00407A"/>
-                <w:sz w:val="20"/>
-              </w:rPr>
-              <w:t>Actie ondernomen t.a.v. de interventie</w:t>
-            </w:r>
-          </w:p>
-        </w:tc>
-        <w:tc>
-          <w:tcPr>
-            <w:tcW w:type="dxa" w:w="4536"/>
-          </w:tcPr>
-          <w:p>
-            <w:r/>
-            <w:r>
-              <w:rPr>
-                <w:b w:val="0"/>
-                <w:color w:val="2E3B47"/>
-                <w:sz w:val="20"/>
-              </w:rPr>
-              <w:t>☐ Geen wijziging   ☐ Tijdelijk onderbroken   ☐ Aangepast   ☐ Definitief gestopt</w:t>
-            </w:r>
-          </w:p>
-        </w:tc>
-      </w:tr>
-      <w:tr>
-        <w:tc>
-          <w:tcPr>
-            <w:tcW w:type="dxa" w:w="4536"/>
-          </w:tcPr>
-          <w:p>
-            <w:r/>
-            <w:r>
-              <w:rPr>
-                <w:b/>
-                <w:color w:val="00407A"/>
-                <w:sz w:val="20"/>
-              </w:rPr>
-              <w:t>Toelichting bij de actie</w:t>
-            </w:r>
-          </w:p>
-        </w:tc>
-        <w:tc>
-          <w:tcPr>
-            <w:tcW w:type="dxa" w:w="4536"/>
-          </w:tcPr>
-          <w:p>
-            <w:r/>
-            <w:r>
-              <w:rPr>
-                <w:b w:val="0"/>
-                <w:color w:val="2E3B47"/>
-                <w:sz w:val="20"/>
-              </w:rPr>
-            </w:r>
-          </w:p>
-        </w:tc>
-      </w:tr>
-      <w:tr>
-        <w:tc>
-          <w:tcPr>
-            <w:tcW w:type="dxa" w:w="4536"/>
-          </w:tcPr>
-          <w:p>
-            <w:r/>
-            <w:r>
-              <w:rPr>
-                <w:b/>
-                <w:color w:val="00407A"/>
-                <w:sz w:val="20"/>
-              </w:rPr>
-              <w:t>Uitkomst</w:t>
-            </w:r>
-          </w:p>
-        </w:tc>
-        <w:tc>
-          <w:tcPr>
-            <w:tcW w:type="dxa" w:w="4536"/>
-          </w:tcPr>
-          <w:p>
-            <w:r/>
-            <w:r>
-              <w:rPr>
-                <w:b w:val="0"/>
-                <w:color w:val="2E3B47"/>
-                <w:sz w:val="20"/>
-              </w:rPr>
-              <w:t>☐ Hersteld/opgelost   ☐ Hersteld met restletsel   ☐ Nog niet hersteld   ☐ Overleden   ☐ Onbekend</w:t>
-            </w:r>
-          </w:p>
-        </w:tc>
-      </w:tr>
-    </w:tbl>
-    <w:p>
-      <w:pPr>
-        <w:spacing w:before="200" w:after="80"/>
-        <w:shd w:val="clear" w:color="auto" w:fill="FF7A00"/>
-      </w:pPr>
+        <w:t>2. Ernst</w:t>
+      </w:r>
+    </w:p>
+    <w:p>
+      <w:r>
+        <w:rPr>
+          <w:color w:val="2E3B47"/>
+        </w:rPr>
+        <w:t>Een Serious Adverse Event (SAE) is elk event dat resulteert in: overlijden, een levensbedreigende situatie, hospitalisatie of verlenging van bestaande hospitalisatie, blijvende of significante invaliditeit, een aangeboren afwijking, of een andere belangrijke medische gebeurtenis.</w:t>
+      </w:r>
+    </w:p>
+    <w:p>
+      <w:r>
+        <w:rPr>
+          <w:color w:val="2E3B47"/>
+        </w:rPr>
+        <w:t>Classificatie:</w:t>
+      </w:r>
+    </w:p>
+    <w:p>
+      <w:r>
+        <w:rPr>
+          <w:color w:val="2E3B47"/>
+        </w:rPr>
+        <w:t>☐ Adverse Event (AE)</w:t>
+      </w:r>
+    </w:p>
+    <w:p>
+      <w:r>
+        <w:rPr>
+          <w:color w:val="2E3B47"/>
+        </w:rPr>
+        <w:t>☐ Serious Adverse Event (SAE)</w:t>
+      </w:r>
+    </w:p>
+    <w:p>
+      <w:r>
+        <w:rPr>
+          <w:color w:val="2E3B47"/>
+        </w:rPr>
+        <w:t>Indien SAE, reden ernstig (meerdere mogelijk):</w:t>
+      </w:r>
+    </w:p>
+    <w:p>
+      <w:r>
+        <w:rPr>
+          <w:color w:val="2E3B47"/>
+        </w:rPr>
+        <w:t>☐ Overlijden</w:t>
+      </w:r>
+    </w:p>
+    <w:p>
+      <w:r>
+        <w:rPr>
+          <w:color w:val="2E3B47"/>
+        </w:rPr>
+        <w:t>☐ Levensbedreigend</w:t>
+      </w:r>
+    </w:p>
+    <w:p>
+      <w:r>
+        <w:rPr>
+          <w:color w:val="2E3B47"/>
+        </w:rPr>
+        <w:t>☐ Hospitalisatie of verlenging van hospitalisatie</w:t>
+      </w:r>
+    </w:p>
+    <w:p>
+      <w:r>
+        <w:rPr>
+          <w:color w:val="2E3B47"/>
+        </w:rPr>
+        <w:t>☐ Blijvende of significante invaliditeit</w:t>
+      </w:r>
+    </w:p>
+    <w:p>
+      <w:r>
+        <w:rPr>
+          <w:color w:val="2E3B47"/>
+        </w:rPr>
+        <w:t>☐ Aangeboren afwijking</w:t>
+      </w:r>
+    </w:p>
+    <w:p>
+      <w:r>
+        <w:rPr>
+          <w:color w:val="2E3B47"/>
+        </w:rPr>
+        <w:t>☐ Andere belangrijke medische gebeurtenis</w:t>
+      </w:r>
+    </w:p>
+    <w:p>
+      <w:r>
+        <w:rPr>
+          <w:color w:val="2E3B47"/>
+        </w:rPr>
+        <w:t>Ernstgraad:</w:t>
+      </w:r>
+    </w:p>
+    <w:p>
+      <w:r>
+        <w:rPr>
+          <w:color w:val="2E3B47"/>
+        </w:rPr>
+        <w:t>☐ Mild</w:t>
+      </w:r>
+    </w:p>
+    <w:p>
+      <w:r>
+        <w:rPr>
+          <w:color w:val="2E3B47"/>
+        </w:rPr>
+        <w:t>☐ Matig</w:t>
+      </w:r>
+    </w:p>
+    <w:p>
+      <w:r>
+        <w:rPr>
+          <w:color w:val="2E3B47"/>
+        </w:rPr>
+        <w:t>☐ Ernstig</w:t>
+      </w:r>
+    </w:p>
+    <w:p>
+      <w:r>
+        <w:rPr>
+          <w:color w:val="2E3B47"/>
+        </w:rPr>
+        <w:t>Causaliteit t.o.v. de PARADISE-interventie (CMFO, drukmeting, MoveMonitor, Orthotimer, SEBIA-educatie):</w:t>
+      </w:r>
+    </w:p>
+    <w:p>
+      <w:r>
+        <w:rPr>
+          <w:color w:val="2E3B47"/>
+        </w:rPr>
+        <w:t>☐ Niet gerelateerd</w:t>
+      </w:r>
+    </w:p>
+    <w:p>
+      <w:r>
+        <w:rPr>
+          <w:color w:val="2E3B47"/>
+        </w:rPr>
+        <w:t>☐ Onwaarschijnlijk gerelateerd</w:t>
+      </w:r>
+    </w:p>
+    <w:p>
+      <w:r>
+        <w:rPr>
+          <w:color w:val="2E3B47"/>
+        </w:rPr>
+        <w:t>☐ Mogelijk gerelateerd</w:t>
+      </w:r>
+    </w:p>
+    <w:p>
+      <w:r>
+        <w:rPr>
+          <w:color w:val="2E3B47"/>
+        </w:rPr>
+        <w:t>☐ Waarschijnlijk gerelateerd</w:t>
+      </w:r>
+    </w:p>
+    <w:p>
+      <w:r>
+        <w:rPr>
+          <w:color w:val="2E3B47"/>
+        </w:rPr>
+        <w:t>☐ Zeker gerelateerd</w:t>
+      </w:r>
+    </w:p>
+    <w:p>
+      <w:r>
+        <w:rPr>
+          <w:color w:val="2E3B47"/>
+        </w:rPr>
+        <w:t>Verwacht op basis van het risicoprofiel van de patiënt/interventie?</w:t>
+      </w:r>
+    </w:p>
+    <w:p>
+      <w:r>
+        <w:rPr>
+          <w:color w:val="2E3B47"/>
+        </w:rPr>
+        <w:t>☐ Verwacht</w:t>
+      </w:r>
+    </w:p>
+    <w:p>
+      <w:r>
+        <w:rPr>
+          <w:color w:val="2E3B47"/>
+        </w:rPr>
+        <w:t>☐ Onverwacht</w:t>
+      </w:r>
+    </w:p>
+    <w:p>
+      <w:r>
+        <w:rPr>
+          <w:color w:val="2E3B47"/>
+        </w:rPr>
+        <w:t>Actie ondernomen t.a.v. de interventie:</w:t>
+      </w:r>
+    </w:p>
+    <w:p>
+      <w:r>
+        <w:rPr>
+          <w:color w:val="2E3B47"/>
+        </w:rPr>
+        <w:t>☐ Geen wijziging</w:t>
+      </w:r>
+    </w:p>
+    <w:p>
+      <w:r>
+        <w:rPr>
+          <w:color w:val="2E3B47"/>
+        </w:rPr>
+        <w:t>☐ Tijdelijk onderbroken</w:t>
+      </w:r>
+    </w:p>
+    <w:p>
+      <w:r>
+        <w:rPr>
+          <w:color w:val="2E3B47"/>
+        </w:rPr>
+        <w:t>☐ Aangepast</w:t>
+      </w:r>
+    </w:p>
+    <w:p>
+      <w:r>
+        <w:rPr>
+          <w:color w:val="2E3B47"/>
+        </w:rPr>
+        <w:t>☐ Definitief gestopt</w:t>
+      </w:r>
+    </w:p>
+    <w:p>
+      <w:r>
+        <w:rPr>
+          <w:color w:val="24303B"/>
+        </w:rPr>
+        <w:t>Toelichting bij de actie: _____________________________________________________</w:t>
+      </w:r>
+    </w:p>
+    <w:p>
+      <w:r>
+        <w:rPr>
+          <w:color w:val="2E3B47"/>
+        </w:rPr>
+        <w:t>Uitkomst:</w:t>
+      </w:r>
+    </w:p>
+    <w:p>
+      <w:r>
+        <w:rPr>
+          <w:color w:val="2E3B47"/>
+        </w:rPr>
+        <w:t>☐ Hersteld/opgelost</w:t>
+      </w:r>
+    </w:p>
+    <w:p>
+      <w:r>
+        <w:rPr>
+          <w:color w:val="2E3B47"/>
+        </w:rPr>
+        <w:t>☐ Hersteld met restletsel</w:t>
+      </w:r>
+    </w:p>
+    <w:p>
+      <w:r>
+        <w:rPr>
+          <w:color w:val="2E3B47"/>
+        </w:rPr>
+        <w:t>☐ Nog niet hersteld</w:t>
+      </w:r>
+    </w:p>
+    <w:p>
+      <w:r>
+        <w:rPr>
+          <w:color w:val="2E3B47"/>
+        </w:rPr>
+        <w:t>☐ Overleden</w:t>
+      </w:r>
+    </w:p>
+    <w:p>
+      <w:r>
+        <w:rPr>
+          <w:color w:val="2E3B47"/>
+        </w:rPr>
+        <w:t>☐ Onbekend</w:t>
+      </w:r>
+    </w:p>
+    <w:p/>
+    <w:p>
       <w:r>
         <w:rPr>
           <w:b/>
-          <w:color w:val="FFFFFF"/>
+          <w:color w:val="123A5F"/>
           <w:sz w:val="24"/>
         </w:rPr>
-        <w:t xml:space="preserve">  3. Amputatie (indien van toepassing)</w:t>
-      </w:r>
-    </w:p>
-    <w:p>
-      <w:r>
-        <w:rPr>
-          <w:i w:val="0"/>
-          <w:color w:val="2E3B47"/>
-          <w:sz w:val="20"/>
+        <w:t>3. Amputatie (indien van toepassing)</w:t>
+      </w:r>
+    </w:p>
+    <w:p>
+      <w:r>
+        <w:rPr>
+          <w:color w:val="2E3B47"/>
         </w:rPr>
         <w:t>In te vullen wanneer het event een amputatie betreft — dit ondersteunt de secundaire eindpunten ‘majeure amputatie’ en ‘mineure amputatie’ conform de internationale Core Outcome Set (Staniszewska et al., Diabetes Care 2024).</w:t>
       </w:r>
     </w:p>
-    <w:tbl>
-      <w:tblPr>
-        <w:tblW w:type="auto" w:w="0"/>
-        <w:tblLook w:firstColumn="1" w:firstRow="1" w:lastColumn="0" w:lastRow="0" w:noHBand="0" w:noVBand="1" w:val="04A0"/>
-        <w:tblBorders>
-          <w:top w:val="single" w:sz="4" w:space="0" w:color="B9C7D1"/>
-          <w:left w:val="single" w:sz="4" w:space="0" w:color="B9C7D1"/>
-          <w:bottom w:val="single" w:sz="4" w:space="0" w:color="B9C7D1"/>
-          <w:right w:val="single" w:sz="4" w:space="0" w:color="B9C7D1"/>
-          <w:insideH w:val="single" w:sz="4" w:space="0" w:color="B9C7D1"/>
-          <w:insideV w:val="single" w:sz="4" w:space="0" w:color="B9C7D1"/>
-        </w:tblBorders>
-      </w:tblPr>
-      <w:tblGrid>
-        <w:gridCol w:w="4536"/>
-        <w:gridCol w:w="4536"/>
-      </w:tblGrid>
-      <w:tr>
-        <w:tc>
-          <w:tcPr>
-            <w:tcW w:type="dxa" w:w="4536"/>
-          </w:tcPr>
-          <w:p>
-            <w:r/>
-            <w:r>
-              <w:rPr>
-                <w:b/>
-                <w:color w:val="00407A"/>
-                <w:sz w:val="20"/>
-              </w:rPr>
-              <w:t>Amputatie opgetreden?</w:t>
-            </w:r>
-          </w:p>
-        </w:tc>
-        <w:tc>
-          <w:tcPr>
-            <w:tcW w:type="dxa" w:w="4536"/>
-          </w:tcPr>
-          <w:p>
-            <w:r/>
-            <w:r>
-              <w:rPr>
-                <w:b w:val="0"/>
-                <w:color w:val="2E3B47"/>
-                <w:sz w:val="20"/>
-              </w:rPr>
-              <w:t>☐ Ja   ☐ Nee</w:t>
-            </w:r>
-          </w:p>
-        </w:tc>
-      </w:tr>
-      <w:tr>
-        <w:tc>
-          <w:tcPr>
-            <w:tcW w:type="dxa" w:w="4536"/>
-          </w:tcPr>
-          <w:p>
-            <w:r/>
-            <w:r>
-              <w:rPr>
-                <w:b/>
-                <w:color w:val="00407A"/>
-                <w:sz w:val="20"/>
-              </w:rPr>
-              <w:t>Niveau</w:t>
-            </w:r>
-          </w:p>
-        </w:tc>
-        <w:tc>
-          <w:tcPr>
-            <w:tcW w:type="dxa" w:w="4536"/>
-          </w:tcPr>
-          <w:p>
-            <w:r/>
-            <w:r>
-              <w:rPr>
-                <w:b w:val="0"/>
-                <w:color w:val="2E3B47"/>
-                <w:sz w:val="20"/>
-              </w:rPr>
-              <w:t>☐ Majeure amputatie (boven enkelniveau)   ☐ Mineure amputatie (onder enkelniveau, bv. teen/voorvoet)</w:t>
-            </w:r>
-          </w:p>
-        </w:tc>
-      </w:tr>
-      <w:tr>
-        <w:tc>
-          <w:tcPr>
-            <w:tcW w:type="dxa" w:w="4536"/>
-          </w:tcPr>
-          <w:p>
-            <w:r/>
-            <w:r>
-              <w:rPr>
-                <w:b/>
-                <w:color w:val="00407A"/>
-                <w:sz w:val="20"/>
-              </w:rPr>
-              <w:t>Datum amputatie</w:t>
-            </w:r>
-          </w:p>
-        </w:tc>
-        <w:tc>
-          <w:tcPr>
-            <w:tcW w:type="dxa" w:w="4536"/>
-          </w:tcPr>
-          <w:p>
-            <w:r/>
-            <w:r>
-              <w:rPr>
-                <w:b w:val="0"/>
-                <w:color w:val="2E3B47"/>
-                <w:sz w:val="20"/>
-              </w:rPr>
-            </w:r>
-          </w:p>
-        </w:tc>
-      </w:tr>
-      <w:tr>
-        <w:tc>
-          <w:tcPr>
-            <w:tcW w:type="dxa" w:w="4536"/>
-          </w:tcPr>
-          <w:p>
-            <w:r/>
-            <w:r>
-              <w:rPr>
-                <w:b/>
-                <w:color w:val="00407A"/>
-                <w:sz w:val="20"/>
-              </w:rPr>
-              <w:t>Zijde (links/rechts)</w:t>
-            </w:r>
-          </w:p>
-        </w:tc>
-        <w:tc>
-          <w:tcPr>
-            <w:tcW w:type="dxa" w:w="4536"/>
-          </w:tcPr>
-          <w:p>
-            <w:r/>
-            <w:r>
-              <w:rPr>
-                <w:b w:val="0"/>
-                <w:color w:val="2E3B47"/>
-                <w:sz w:val="20"/>
-              </w:rPr>
-            </w:r>
-          </w:p>
-        </w:tc>
-      </w:tr>
-      <w:tr>
-        <w:tc>
-          <w:tcPr>
-            <w:tcW w:type="dxa" w:w="4536"/>
-          </w:tcPr>
-          <w:p>
-            <w:r/>
-            <w:r>
-              <w:rPr>
-                <w:b/>
-                <w:color w:val="00407A"/>
-                <w:sz w:val="20"/>
-              </w:rPr>
-              <w:t>Reden/indicatie</w:t>
-            </w:r>
-          </w:p>
-        </w:tc>
-        <w:tc>
-          <w:tcPr>
-            <w:tcW w:type="dxa" w:w="4536"/>
-          </w:tcPr>
-          <w:p>
-            <w:r/>
-            <w:r>
-              <w:rPr>
-                <w:b w:val="0"/>
-                <w:color w:val="2E3B47"/>
-                <w:sz w:val="20"/>
-              </w:rPr>
-            </w:r>
-          </w:p>
-        </w:tc>
-      </w:tr>
-    </w:tbl>
-    <w:p>
-      <w:pPr>
-        <w:spacing w:before="200" w:after="80"/>
-        <w:shd w:val="clear" w:color="auto" w:fill="FF7A00"/>
-      </w:pPr>
+    <w:p>
+      <w:r>
+        <w:rPr>
+          <w:color w:val="2E3B47"/>
+        </w:rPr>
+        <w:t>Amputatie opgetreden?</w:t>
+      </w:r>
+    </w:p>
+    <w:p>
+      <w:r>
+        <w:rPr>
+          <w:color w:val="2E3B47"/>
+        </w:rPr>
+        <w:t>☐ Ja</w:t>
+      </w:r>
+    </w:p>
+    <w:p>
+      <w:r>
+        <w:rPr>
+          <w:color w:val="2E3B47"/>
+        </w:rPr>
+        <w:t>☐ Nee</w:t>
+      </w:r>
+    </w:p>
+    <w:p>
+      <w:r>
+        <w:rPr>
+          <w:color w:val="2E3B47"/>
+        </w:rPr>
+        <w:t>Niveau:</w:t>
+      </w:r>
+    </w:p>
+    <w:p>
+      <w:r>
+        <w:rPr>
+          <w:color w:val="2E3B47"/>
+        </w:rPr>
+        <w:t>☐ Majeure amputatie (boven enkelniveau)</w:t>
+      </w:r>
+    </w:p>
+    <w:p>
+      <w:r>
+        <w:rPr>
+          <w:color w:val="2E3B47"/>
+        </w:rPr>
+        <w:t>☐ Mineure amputatie (onder enkelniveau, bv. teen/voorvoet)</w:t>
+      </w:r>
+    </w:p>
+    <w:p>
+      <w:r>
+        <w:rPr>
+          <w:color w:val="24303B"/>
+        </w:rPr>
+        <w:t>Datum amputatie: ____ / ____ / ______</w:t>
+      </w:r>
+    </w:p>
+    <w:p>
+      <w:r>
+        <w:rPr>
+          <w:color w:val="2E3B47"/>
+        </w:rPr>
+        <w:t>Zijde:</w:t>
+      </w:r>
+    </w:p>
+    <w:p>
+      <w:r>
+        <w:rPr>
+          <w:color w:val="2E3B47"/>
+        </w:rPr>
+        <w:t>☐ Links</w:t>
+      </w:r>
+    </w:p>
+    <w:p>
+      <w:r>
+        <w:rPr>
+          <w:color w:val="2E3B47"/>
+        </w:rPr>
+        <w:t>☐ Rechts</w:t>
+      </w:r>
+    </w:p>
+    <w:p>
+      <w:r>
+        <w:rPr>
+          <w:color w:val="24303B"/>
+        </w:rPr>
+        <w:t>Reden/indicatie: _____________________________________________________________</w:t>
+      </w:r>
+    </w:p>
+    <w:p/>
+    <w:p>
       <w:r>
         <w:rPr>
           <w:b/>
-          <w:color w:val="FFFFFF"/>
+          <w:color w:val="123A5F"/>
           <w:sz w:val="24"/>
         </w:rPr>
-        <w:t xml:space="preserve">  4. Overlijden (indien van toepassing)</w:t>
-      </w:r>
-    </w:p>
-    <w:p>
-      <w:r>
-        <w:rPr>
-          <w:i w:val="0"/>
-          <w:color w:val="2E3B47"/>
-          <w:sz w:val="20"/>
+        <w:t>4. Overlijden (indien van toepassing)</w:t>
+      </w:r>
+    </w:p>
+    <w:p>
+      <w:r>
+        <w:rPr>
+          <w:color w:val="2E3B47"/>
         </w:rPr>
         <w:t>In te vullen wanneer het event het overlijden van de deelnemer betreft — dit ondersteunt het secundaire eindpunt ‘mortaliteit’ conform de internationale Core Outcome Set.</w:t>
       </w:r>
     </w:p>
-    <w:tbl>
-      <w:tblPr>
-        <w:tblW w:type="auto" w:w="0"/>
-        <w:tblLook w:firstColumn="1" w:firstRow="1" w:lastColumn="0" w:lastRow="0" w:noHBand="0" w:noVBand="1" w:val="04A0"/>
-        <w:tblBorders>
-          <w:top w:val="single" w:sz="4" w:space="0" w:color="B9C7D1"/>
-          <w:left w:val="single" w:sz="4" w:space="0" w:color="B9C7D1"/>
-          <w:bottom w:val="single" w:sz="4" w:space="0" w:color="B9C7D1"/>
-          <w:right w:val="single" w:sz="4" w:space="0" w:color="B9C7D1"/>
-          <w:insideH w:val="single" w:sz="4" w:space="0" w:color="B9C7D1"/>
-          <w:insideV w:val="single" w:sz="4" w:space="0" w:color="B9C7D1"/>
-        </w:tblBorders>
-      </w:tblPr>
-      <w:tblGrid>
-        <w:gridCol w:w="4536"/>
-        <w:gridCol w:w="4536"/>
-      </w:tblGrid>
-      <w:tr>
-        <w:tc>
-          <w:tcPr>
-            <w:tcW w:type="dxa" w:w="4536"/>
-          </w:tcPr>
-          <w:p>
-            <w:r/>
-            <w:r>
-              <w:rPr>
-                <w:b/>
-                <w:color w:val="00407A"/>
-                <w:sz w:val="20"/>
-              </w:rPr>
-              <w:t>Datum overlijden</w:t>
-            </w:r>
-          </w:p>
-        </w:tc>
-        <w:tc>
-          <w:tcPr>
-            <w:tcW w:type="dxa" w:w="4536"/>
-          </w:tcPr>
-          <w:p>
-            <w:r/>
-            <w:r>
-              <w:rPr>
-                <w:b w:val="0"/>
-                <w:color w:val="2E3B47"/>
-                <w:sz w:val="20"/>
-              </w:rPr>
-            </w:r>
-          </w:p>
-        </w:tc>
-      </w:tr>
-      <w:tr>
-        <w:tc>
-          <w:tcPr>
-            <w:tcW w:type="dxa" w:w="4536"/>
-          </w:tcPr>
-          <w:p>
-            <w:r/>
-            <w:r>
-              <w:rPr>
-                <w:b/>
-                <w:color w:val="00407A"/>
-                <w:sz w:val="20"/>
-              </w:rPr>
-              <w:t>Vermoedelijke doodsoorzaak</w:t>
-            </w:r>
-          </w:p>
-        </w:tc>
-        <w:tc>
-          <w:tcPr>
-            <w:tcW w:type="dxa" w:w="4536"/>
-          </w:tcPr>
-          <w:p>
-            <w:r/>
-            <w:r>
-              <w:rPr>
-                <w:b w:val="0"/>
-                <w:color w:val="2E3B47"/>
-                <w:sz w:val="20"/>
-              </w:rPr>
-            </w:r>
-          </w:p>
-        </w:tc>
-      </w:tr>
-      <w:tr>
-        <w:tc>
-          <w:tcPr>
-            <w:tcW w:type="dxa" w:w="4536"/>
-          </w:tcPr>
-          <w:p>
-            <w:r/>
-            <w:r>
-              <w:rPr>
-                <w:b/>
-                <w:color w:val="00407A"/>
-                <w:sz w:val="20"/>
-              </w:rPr>
-              <w:t>Gerelateerd aan de PARADISE-interventie?</w:t>
-            </w:r>
-          </w:p>
-        </w:tc>
-        <w:tc>
-          <w:tcPr>
-            <w:tcW w:type="dxa" w:w="4536"/>
-          </w:tcPr>
-          <w:p>
-            <w:r/>
-            <w:r>
-              <w:rPr>
-                <w:b w:val="0"/>
-                <w:color w:val="2E3B47"/>
-                <w:sz w:val="20"/>
-              </w:rPr>
-              <w:t>☐ Ja   ☐ Nee   ☐ Onbekend</w:t>
-            </w:r>
-          </w:p>
-        </w:tc>
-      </w:tr>
-      <w:tr>
-        <w:tc>
-          <w:tcPr>
-            <w:tcW w:type="dxa" w:w="4536"/>
-          </w:tcPr>
-          <w:p>
-            <w:r/>
-            <w:r>
-              <w:rPr>
-                <w:b/>
-                <w:color w:val="00407A"/>
-                <w:sz w:val="20"/>
-              </w:rPr>
-              <w:t>Autopsie uitgevoerd?</w:t>
-            </w:r>
-          </w:p>
-        </w:tc>
-        <w:tc>
-          <w:tcPr>
-            <w:tcW w:type="dxa" w:w="4536"/>
-          </w:tcPr>
-          <w:p>
-            <w:r/>
-            <w:r>
-              <w:rPr>
-                <w:b w:val="0"/>
-                <w:color w:val="2E3B47"/>
-                <w:sz w:val="20"/>
-              </w:rPr>
-              <w:t>☐ Ja   ☐ Nee   ☐ Onbekend</w:t>
-            </w:r>
-          </w:p>
-        </w:tc>
-      </w:tr>
-    </w:tbl>
-    <w:p>
-      <w:pPr>
-        <w:spacing w:before="200" w:after="80"/>
-        <w:shd w:val="clear" w:color="auto" w:fill="FF7A00"/>
-      </w:pPr>
+    <w:p>
+      <w:r>
+        <w:rPr>
+          <w:color w:val="24303B"/>
+        </w:rPr>
+        <w:t>Datum overlijden: ____ / ____ / ______</w:t>
+      </w:r>
+    </w:p>
+    <w:p>
+      <w:r>
+        <w:rPr>
+          <w:color w:val="24303B"/>
+        </w:rPr>
+        <w:t>Vermoedelijke doodsoorzaak: _____________________________________________________</w:t>
+      </w:r>
+    </w:p>
+    <w:p>
+      <w:r>
+        <w:rPr>
+          <w:color w:val="2E3B47"/>
+        </w:rPr>
+        <w:t>Gerelateerd aan de PARADISE-interventie?</w:t>
+      </w:r>
+    </w:p>
+    <w:p>
+      <w:r>
+        <w:rPr>
+          <w:color w:val="2E3B47"/>
+        </w:rPr>
+        <w:t>☐ Ja</w:t>
+      </w:r>
+    </w:p>
+    <w:p>
+      <w:r>
+        <w:rPr>
+          <w:color w:val="2E3B47"/>
+        </w:rPr>
+        <w:t>☐ Nee</w:t>
+      </w:r>
+    </w:p>
+    <w:p>
+      <w:r>
+        <w:rPr>
+          <w:color w:val="2E3B47"/>
+        </w:rPr>
+        <w:t>☐ Onbekend</w:t>
+      </w:r>
+    </w:p>
+    <w:p>
+      <w:r>
+        <w:rPr>
+          <w:color w:val="2E3B47"/>
+        </w:rPr>
+        <w:t>Autopsie uitgevoerd?</w:t>
+      </w:r>
+    </w:p>
+    <w:p>
+      <w:r>
+        <w:rPr>
+          <w:color w:val="2E3B47"/>
+        </w:rPr>
+        <w:t>☐ Ja</w:t>
+      </w:r>
+    </w:p>
+    <w:p>
+      <w:r>
+        <w:rPr>
+          <w:color w:val="2E3B47"/>
+        </w:rPr>
+        <w:t>☐ Nee</w:t>
+      </w:r>
+    </w:p>
+    <w:p>
+      <w:r>
+        <w:rPr>
+          <w:color w:val="2E3B47"/>
+        </w:rPr>
+        <w:t>☐ Onbekend</w:t>
+      </w:r>
+    </w:p>
+    <w:p/>
+    <w:p>
       <w:r>
         <w:rPr>
           <w:b/>
-          <w:color w:val="FFFFFF"/>
+          <w:color w:val="123A5F"/>
           <w:sz w:val="24"/>
         </w:rPr>
-        <w:t xml:space="preserve">  5. Melding</w:t>
-      </w:r>
-    </w:p>
-    <w:p>
-      <w:r>
-        <w:rPr>
-          <w:i w:val="0"/>
-          <w:color w:val="2E3B47"/>
-          <w:sz w:val="20"/>
+        <w:t>5. Melding</w:t>
+      </w:r>
+    </w:p>
+    <w:p>
+      <w:r>
+        <w:rPr>
+          <w:color w:val="2E3B47"/>
         </w:rPr>
         <w:t>Bij een SAE: melding aan de sponsor dient te gebeuren binnen 72 uur na kennisname door de onderzoeker (§6).</w:t>
       </w:r>
     </w:p>
-    <w:tbl>
-      <w:tblPr>
-        <w:tblW w:type="auto" w:w="0"/>
-        <w:tblLook w:firstColumn="1" w:firstRow="1" w:lastColumn="0" w:lastRow="0" w:noHBand="0" w:noVBand="1" w:val="04A0"/>
-        <w:tblBorders>
-          <w:top w:val="single" w:sz="4" w:space="0" w:color="B9C7D1"/>
-          <w:left w:val="single" w:sz="4" w:space="0" w:color="B9C7D1"/>
-          <w:bottom w:val="single" w:sz="4" w:space="0" w:color="B9C7D1"/>
-          <w:right w:val="single" w:sz="4" w:space="0" w:color="B9C7D1"/>
-          <w:insideH w:val="single" w:sz="4" w:space="0" w:color="B9C7D1"/>
-          <w:insideV w:val="single" w:sz="4" w:space="0" w:color="B9C7D1"/>
-        </w:tblBorders>
-      </w:tblPr>
-      <w:tblGrid>
-        <w:gridCol w:w="4536"/>
-        <w:gridCol w:w="4536"/>
-      </w:tblGrid>
-      <w:tr>
-        <w:tc>
-          <w:tcPr>
-            <w:tcW w:type="dxa" w:w="4536"/>
-          </w:tcPr>
-          <w:p>
-            <w:r/>
-            <w:r>
-              <w:rPr>
-                <w:b/>
-                <w:color w:val="00407A"/>
-                <w:sz w:val="20"/>
-              </w:rPr>
-              <w:t>Datum melding aan PI</w:t>
-            </w:r>
-          </w:p>
-        </w:tc>
-        <w:tc>
-          <w:tcPr>
-            <w:tcW w:type="dxa" w:w="4536"/>
-          </w:tcPr>
-          <w:p>
-            <w:r/>
-            <w:r>
-              <w:rPr>
-                <w:b w:val="0"/>
-                <w:color w:val="2E3B47"/>
-                <w:sz w:val="20"/>
-              </w:rPr>
-            </w:r>
-          </w:p>
-        </w:tc>
-      </w:tr>
-      <w:tr>
-        <w:tc>
-          <w:tcPr>
-            <w:tcW w:type="dxa" w:w="4536"/>
-          </w:tcPr>
-          <w:p>
-            <w:r/>
-            <w:r>
-              <w:rPr>
-                <w:b/>
-                <w:color w:val="00407A"/>
-                <w:sz w:val="20"/>
-              </w:rPr>
-              <w:t>Datum melding aan sponsor (indien SAE, ≤ 72u na kennisname)</w:t>
-            </w:r>
-          </w:p>
-        </w:tc>
-        <w:tc>
-          <w:tcPr>
-            <w:tcW w:type="dxa" w:w="4536"/>
-          </w:tcPr>
-          <w:p>
-            <w:r/>
-            <w:r>
-              <w:rPr>
-                <w:b w:val="0"/>
-                <w:color w:val="2E3B47"/>
-                <w:sz w:val="20"/>
-              </w:rPr>
-            </w:r>
-          </w:p>
-        </w:tc>
-      </w:tr>
-      <w:tr>
-        <w:tc>
-          <w:tcPr>
-            <w:tcW w:type="dxa" w:w="4536"/>
-          </w:tcPr>
-          <w:p>
-            <w:r/>
-            <w:r>
-              <w:rPr>
-                <w:b/>
-                <w:color w:val="00407A"/>
-                <w:sz w:val="20"/>
-              </w:rPr>
-              <w:t>Datum melding aan Ethische Commissie / FAGG (indien van toepassing)</w:t>
-            </w:r>
-          </w:p>
-        </w:tc>
-        <w:tc>
-          <w:tcPr>
-            <w:tcW w:type="dxa" w:w="4536"/>
-          </w:tcPr>
-          <w:p>
-            <w:r/>
-            <w:r>
-              <w:rPr>
-                <w:b w:val="0"/>
-                <w:color w:val="2E3B47"/>
-                <w:sz w:val="20"/>
-              </w:rPr>
-            </w:r>
-          </w:p>
-        </w:tc>
-      </w:tr>
-      <w:tr>
-        <w:tc>
-          <w:tcPr>
-            <w:tcW w:type="dxa" w:w="4536"/>
-          </w:tcPr>
-          <w:p>
-            <w:r/>
-            <w:r>
-              <w:rPr>
-                <w:b/>
-                <w:color w:val="00407A"/>
-                <w:sz w:val="20"/>
-              </w:rPr>
-              <w:t>Naam en functie van de beoordelaar</w:t>
-            </w:r>
-          </w:p>
-        </w:tc>
-        <w:tc>
-          <w:tcPr>
-            <w:tcW w:type="dxa" w:w="4536"/>
-          </w:tcPr>
-          <w:p>
-            <w:r/>
-            <w:r>
-              <w:rPr>
-                <w:b w:val="0"/>
-                <w:color w:val="2E3B47"/>
-                <w:sz w:val="20"/>
-              </w:rPr>
-            </w:r>
-          </w:p>
-        </w:tc>
-      </w:tr>
-    </w:tbl>
-    <w:p>
-      <w:pPr>
-        <w:spacing w:before="200" w:after="80"/>
-        <w:shd w:val="clear" w:color="auto" w:fill="FF7A00"/>
-      </w:pPr>
+    <w:p>
+      <w:r>
+        <w:rPr>
+          <w:color w:val="24303B"/>
+        </w:rPr>
+        <w:t>Datum melding aan PI: ____ / ____ / ______</w:t>
+      </w:r>
+    </w:p>
+    <w:p>
+      <w:r>
+        <w:rPr>
+          <w:color w:val="24303B"/>
+        </w:rPr>
+        <w:t>Datum melding aan sponsor (indien SAE, ≤ 72u na kennisname): ____ / ____ / ______</w:t>
+      </w:r>
+    </w:p>
+    <w:p>
+      <w:r>
+        <w:rPr>
+          <w:color w:val="24303B"/>
+        </w:rPr>
+        <w:t>Datum melding aan Ethische Commissie / FAGG (indien van toepassing): ____ / ____ / ______</w:t>
+      </w:r>
+    </w:p>
+    <w:p>
+      <w:r>
+        <w:rPr>
+          <w:color w:val="24303B"/>
+        </w:rPr>
+        <w:t>Naam en functie van de beoordelaar: _____________________________________________</w:t>
+      </w:r>
+    </w:p>
+    <w:p/>
+    <w:p>
       <w:r>
         <w:rPr>
           <w:b/>
-          <w:color w:val="FFFFFF"/>
+          <w:color w:val="123A5F"/>
           <w:sz w:val="24"/>
         </w:rPr>
-        <w:t xml:space="preserve">  6. Opmerkingen</w:t>
-      </w:r>
-    </w:p>
-    <w:p>
-      <w:r>
-        <w:rPr>
-          <w:color w:val="C7D0D8"/>
-        </w:rPr>
-        <w:t>......................................................................................................................</w:t>
-      </w:r>
-    </w:p>
-    <w:p>
-      <w:r>
-        <w:rPr>
-          <w:color w:val="C7D0D8"/>
-        </w:rPr>
-        <w:t>......................................................................................................................</w:t>
-      </w:r>
-    </w:p>
-    <w:p>
-      <w:r>
-        <w:rPr>
-          <w:color w:val="C7D0D8"/>
-        </w:rPr>
-        <w:t>......................................................................................................................</w:t>
-      </w:r>
-    </w:p>
-    <w:p>
-      <w:r>
-        <w:rPr>
-          <w:color w:val="C7D0D8"/>
-        </w:rPr>
-        <w:t>......................................................................................................................</w:t>
-      </w:r>
-    </w:p>
+        <w:t>6. Opmerkingen</w:t>
+      </w:r>
+    </w:p>
+    <w:p/>
+    <w:p/>
+    <w:p/>
+    <w:p/>
     <w:sectPr>
       <w:headerReference w:type="default" r:id="rId7"/>
       <w:footerReference w:type="default" r:id="rId8"/>
@@ -1372,7 +881,7 @@
         <w:sz w:val="16"/>
         <w:szCs w:val="16"/>
       </w:rPr>
-      <w:t xml:space="preserve">  eCRF 45b: </w:t>
+      <w:t xml:space="preserve">  eCRF 46: </w:t>
     </w:r>
     <w:proofErr w:type="spellStart"/>
     <w:r>
@@ -1381,7 +890,7 @@
         <w:sz w:val="16"/>
         <w:szCs w:val="16"/>
       </w:rPr>
-      <w:t>Gezondheidseconomisch</w:t>
+      <w:t>AE/SAE</w:t>
     </w:r>
     <w:proofErr w:type="spellEnd"/>
     <w:r>
@@ -1390,7 +899,7 @@
         <w:sz w:val="16"/>
         <w:szCs w:val="16"/>
       </w:rPr>
-      <w:t xml:space="preserve"> dagboek (vervolg) </w:t>
+      <w:t xml:space="preserve"> Report Form </w:t>
     </w:r>
     <w:proofErr w:type="gramStart"/>
     <w:r>
@@ -1469,7 +978,7 @@
         <w:sz w:val="16"/>
         <w:szCs w:val="16"/>
       </w:rPr>
-      <w:t>[ 27</w:t>
+      <w:t>[ 03</w:t>
     </w:r>
     <w:proofErr w:type="gramEnd"/>
     <w:r>
@@ -1480,7 +989,7 @@
         <w:sz w:val="16"/>
         <w:szCs w:val="16"/>
       </w:rPr>
-      <w:t>/07/</w:t>
+      <w:t>/08/</w:t>
     </w:r>
     <w:proofErr w:type="gramStart"/>
     <w:r>

</xml_diff>